<commit_message>
Update DiarioMatteo-27.05 and create diarioMatteo-29.05
</commit_message>
<xml_diff>
--- a/1_Documentazione/DiarioMatteo-27.05.docx
+++ b/1_Documentazione/DiarioMatteo-27.05.docx
@@ -245,13 +245,25 @@
               <w:rPr>
                 <w:rFonts w:ascii="Arial" w:hAnsi="Arial" w:cs="Arial"/>
               </w:rPr>
-              <w:t>16:</w:t>
+              <w:t>1</w:t>
             </w:r>
             <w:r>
               <w:rPr>
                 <w:rFonts w:ascii="Arial" w:hAnsi="Arial" w:cs="Arial"/>
               </w:rPr>
-              <w:t>09</w:t>
+              <w:t>3</w:t>
+            </w:r>
+            <w:r>
+              <w:rPr>
+                <w:rFonts w:ascii="Arial" w:hAnsi="Arial" w:cs="Arial"/>
+              </w:rPr>
+              <w:t>:</w:t>
+            </w:r>
+            <w:r>
+              <w:rPr>
+                <w:rFonts w:ascii="Arial" w:hAnsi="Arial" w:cs="Arial"/>
+              </w:rPr>
+              <w:t>45</w:t>
             </w:r>
           </w:p>
         </w:tc>
@@ -2857,6 +2869,7 @@
     <w:rsid w:val="00B532B4"/>
     <w:rsid w:val="00B7646A"/>
     <w:rsid w:val="00BC14BB"/>
+    <w:rsid w:val="00BC2497"/>
     <w:rsid w:val="00BC3196"/>
     <w:rsid w:val="00BD0D3A"/>
     <w:rsid w:val="00BE1173"/>
@@ -2892,6 +2905,7 @@
     <w:rsid w:val="00E52C95"/>
     <w:rsid w:val="00E67A57"/>
     <w:rsid w:val="00E738CB"/>
+    <w:rsid w:val="00E8455E"/>
     <w:rsid w:val="00E91168"/>
     <w:rsid w:val="00EB6CE8"/>
     <w:rsid w:val="00EE6084"/>

</xml_diff>